<commit_message>
Update RFPG CV document
Refreshes the CV - RFPG.docx content and removes the temporary Word lock file (~$ - RFPG.docx) created during editing.
</commit_message>
<xml_diff>
--- a/CV - RFPG.docx
+++ b/CV - RFPG.docx
@@ -104,7 +104,6 @@
         <w:t xml:space="preserve">|  Pucallpa, Perú |  </w:t>
       </w:r>
       <w:hyperlink r:id="rId6" w:history="1">
-        <w:proofErr w:type="spellStart"/>
         <w:r>
           <w:rPr>
             <w:rStyle w:val="Hipervnculo"/>
@@ -115,7 +114,6 @@
           </w:rPr>
           <w:t>Github</w:t>
         </w:r>
-        <w:proofErr w:type="spellEnd"/>
       </w:hyperlink>
       <w:r>
         <w:rPr>
@@ -127,7 +125,6 @@
         <w:t xml:space="preserve">  |  </w:t>
       </w:r>
       <w:hyperlink r:id="rId7" w:history="1">
-        <w:proofErr w:type="spellStart"/>
         <w:r>
           <w:rPr>
             <w:rStyle w:val="Hipervnculo"/>
@@ -138,7 +135,6 @@
           </w:rPr>
           <w:t>Linkedin</w:t>
         </w:r>
-        <w:proofErr w:type="spellEnd"/>
       </w:hyperlink>
     </w:p>
     <w:p>
@@ -182,67 +178,7 @@
           <w:iCs/>
           <w:lang w:val="es-ES"/>
         </w:rPr>
-        <w:t xml:space="preserve">Estudiante de Ingeniería de Sistemas (IX ciclo) con experiencia práctica en desarrollo de software y </w:t>
-      </w:r>
-      <w:proofErr w:type="spellStart"/>
-      <w:r>
-        <w:rPr>
-          <w:rFonts w:ascii="Calibri" w:eastAsia="Calibri" w:hAnsi="Calibri" w:cs="Calibri"/>
-          <w:i/>
-          <w:iCs/>
-          <w:lang w:val="es-ES"/>
-        </w:rPr>
-        <w:t>testing</w:t>
-      </w:r>
-      <w:proofErr w:type="spellEnd"/>
-      <w:r>
-        <w:rPr>
-          <w:rFonts w:ascii="Calibri" w:eastAsia="Calibri" w:hAnsi="Calibri" w:cs="Calibri"/>
-          <w:i/>
-          <w:iCs/>
-          <w:lang w:val="es-ES"/>
-        </w:rPr>
-        <w:t xml:space="preserve">. He participado en el desarrollo y mejora de interfaces web, integración </w:t>
-      </w:r>
-      <w:proofErr w:type="spellStart"/>
-      <w:r>
-        <w:rPr>
-          <w:rFonts w:ascii="Calibri" w:eastAsia="Calibri" w:hAnsi="Calibri" w:cs="Calibri"/>
-          <w:i/>
-          <w:iCs/>
-          <w:lang w:val="es-ES"/>
-        </w:rPr>
-        <w:t>frontend</w:t>
-      </w:r>
-      <w:proofErr w:type="spellEnd"/>
-      <w:r>
-        <w:rPr>
-          <w:rFonts w:ascii="Calibri" w:eastAsia="Calibri" w:hAnsi="Calibri" w:cs="Calibri"/>
-          <w:i/>
-          <w:iCs/>
-          <w:lang w:val="es-ES"/>
-        </w:rPr>
-        <w:t>–</w:t>
-      </w:r>
-      <w:proofErr w:type="spellStart"/>
-      <w:r>
-        <w:rPr>
-          <w:rFonts w:ascii="Calibri" w:eastAsia="Calibri" w:hAnsi="Calibri" w:cs="Calibri"/>
-          <w:i/>
-          <w:iCs/>
-          <w:lang w:val="es-ES"/>
-        </w:rPr>
-        <w:t>backend</w:t>
-      </w:r>
-      <w:proofErr w:type="spellEnd"/>
-      <w:r>
-        <w:rPr>
-          <w:rFonts w:ascii="Calibri" w:eastAsia="Calibri" w:hAnsi="Calibri" w:cs="Calibri"/>
-          <w:i/>
-          <w:iCs/>
-          <w:lang w:val="es-ES"/>
-        </w:rPr>
-        <w:t>, diseño de bases de datos y automatización de pruebas. Experiencia trabajando con HTML, CSS, JavaScript, Angular, Node.js y MySQL, así como en equipos bajo metodología Scrum.</w:t>
+        <w:t>Estudiante de Ingeniería de Sistemas (IX ciclo) con experiencia práctica en desarrollo de software y testing. He participado en el desarrollo y mejora de interfaces web, integración frontend–backend, diseño de bases de datos y automatización de pruebas. Experiencia trabajando con HTML, CSS, JavaScript, Angular, Node.js y MySQL, así como en equipos bajo metodología Scrum.</w:t>
       </w:r>
     </w:p>
     <w:p>
@@ -316,337 +252,182 @@
           <w:iCs/>
           <w:lang w:val="es-ES"/>
         </w:rPr>
+        <w:t xml:space="preserve"> TypeScript, JavaScript, SQL.</w:t>
+      </w:r>
+    </w:p>
+    <w:p>
+      <w:pPr>
+        <w:spacing w:line="276" w:lineRule="auto"/>
+        <w:jc w:val="both"/>
+        <w:rPr>
+          <w:rFonts w:ascii="Calibri" w:hAnsi="Calibri" w:cs="Calibri"/>
+          <w:i/>
+          <w:iCs/>
+          <w:lang w:val="es-ES"/>
+        </w:rPr>
+      </w:pPr>
+      <w:r>
+        <w:rPr>
+          <w:rFonts w:ascii="Calibri" w:hAnsi="Calibri" w:cs="Calibri"/>
+          <w:b/>
+          <w:bCs/>
+          <w:i/>
+          <w:iCs/>
+          <w:lang w:val="es-ES"/>
+        </w:rPr>
+        <w:t>Desarrollo Frontend &amp; Diseño UI:</w:t>
+      </w:r>
+      <w:r>
+        <w:rPr>
+          <w:rFonts w:ascii="Calibri" w:hAnsi="Calibri" w:cs="Calibri"/>
+          <w:i/>
+          <w:iCs/>
+          <w:lang w:val="es-ES"/>
+        </w:rPr>
+        <w:t xml:space="preserve"> Angular, HTML5, CSS3, Figma, Balsamiq Wireframes.</w:t>
+      </w:r>
+    </w:p>
+    <w:p>
+      <w:pPr>
+        <w:spacing w:line="276" w:lineRule="auto"/>
+        <w:jc w:val="both"/>
+        <w:rPr>
+          <w:rFonts w:ascii="Calibri" w:hAnsi="Calibri" w:cs="Calibri"/>
+          <w:i/>
+          <w:iCs/>
+        </w:rPr>
+      </w:pPr>
+      <w:r>
+        <w:rPr>
+          <w:rFonts w:ascii="Calibri" w:hAnsi="Calibri" w:cs="Calibri"/>
+          <w:b/>
+          <w:bCs/>
+          <w:i/>
+          <w:iCs/>
+        </w:rPr>
+        <w:t>Desarrollo Backend &amp; APIs:</w:t>
+      </w:r>
+      <w:r>
+        <w:rPr>
+          <w:rFonts w:ascii="Calibri" w:hAnsi="Calibri" w:cs="Calibri"/>
+          <w:i/>
+          <w:iCs/>
+        </w:rPr>
+        <w:t xml:space="preserve"> Node.js, Spring Boot, Postman, Swagger UI, Arquitectura REST.</w:t>
+      </w:r>
+    </w:p>
+    <w:p>
+      <w:pPr>
+        <w:spacing w:line="276" w:lineRule="auto"/>
+        <w:jc w:val="both"/>
+        <w:rPr>
+          <w:rFonts w:ascii="Calibri" w:hAnsi="Calibri" w:cs="Calibri"/>
+          <w:i/>
+          <w:iCs/>
+          <w:lang w:val="es-ES"/>
+        </w:rPr>
+      </w:pPr>
+      <w:r>
+        <w:rPr>
+          <w:rFonts w:ascii="Calibri" w:hAnsi="Calibri" w:cs="Calibri"/>
+          <w:b/>
+          <w:bCs/>
+          <w:i/>
+          <w:iCs/>
+          <w:lang w:val="es-ES"/>
+        </w:rPr>
+        <w:t>Bases de Datos:</w:t>
+      </w:r>
+      <w:r>
+        <w:rPr>
+          <w:rFonts w:ascii="Calibri" w:hAnsi="Calibri" w:cs="Calibri"/>
+          <w:i/>
+          <w:iCs/>
+          <w:lang w:val="es-ES"/>
+        </w:rPr>
+        <w:t xml:space="preserve"> MySQL, SQL Server</w:t>
+      </w:r>
+      <w:r>
+        <w:rPr>
+          <w:rFonts w:ascii="Calibri" w:hAnsi="Calibri" w:cs="Calibri"/>
+          <w:i/>
+          <w:iCs/>
+          <w:lang w:val="es-ES"/>
+        </w:rPr>
+        <w:t>.</w:t>
+      </w:r>
+    </w:p>
+    <w:p>
+      <w:pPr>
+        <w:spacing w:line="276" w:lineRule="auto"/>
+        <w:jc w:val="both"/>
+        <w:rPr>
+          <w:rFonts w:ascii="Calibri" w:hAnsi="Calibri" w:cs="Calibri"/>
+          <w:i/>
+          <w:iCs/>
+          <w:lang w:val="es-ES"/>
+        </w:rPr>
+      </w:pPr>
+      <w:r>
+        <w:rPr>
+          <w:rFonts w:ascii="Calibri" w:hAnsi="Calibri" w:cs="Calibri"/>
+          <w:b/>
+          <w:bCs/>
+          <w:i/>
+          <w:iCs/>
+          <w:lang w:val="es-ES"/>
+        </w:rPr>
+        <w:t>Testing &amp; Automatización:</w:t>
+      </w:r>
+      <w:r>
+        <w:rPr>
+          <w:rFonts w:ascii="Calibri" w:hAnsi="Calibri" w:cs="Calibri"/>
+          <w:i/>
+          <w:iCs/>
+          <w:lang w:val="es-ES"/>
+        </w:rPr>
+        <w:t xml:space="preserve"> Selenium IDE, Pruebas funcionales.</w:t>
+      </w:r>
+    </w:p>
+    <w:p>
+      <w:pPr>
+        <w:spacing w:line="276" w:lineRule="auto"/>
+        <w:jc w:val="both"/>
+        <w:rPr>
+          <w:rFonts w:ascii="Calibri" w:hAnsi="Calibri" w:cs="Calibri"/>
+          <w:i/>
+          <w:iCs/>
+          <w:lang w:val="es-ES"/>
+        </w:rPr>
+      </w:pPr>
+      <w:r>
+        <w:rPr>
+          <w:rFonts w:ascii="Calibri" w:hAnsi="Calibri" w:cs="Calibri"/>
+          <w:b/>
+          <w:bCs/>
+          <w:i/>
+          <w:iCs/>
+          <w:lang w:val="es-ES"/>
+        </w:rPr>
+        <w:t>DevOps, Despliegue &amp; Herramientas:</w:t>
+      </w:r>
+      <w:r>
+        <w:rPr>
+          <w:rFonts w:ascii="Calibri" w:hAnsi="Calibri" w:cs="Calibri"/>
+          <w:i/>
+          <w:iCs/>
+          <w:lang w:val="es-ES"/>
+        </w:rPr>
         <w:t xml:space="preserve"> </w:t>
       </w:r>
-      <w:proofErr w:type="spellStart"/>
-      <w:r>
-        <w:rPr>
-          <w:rFonts w:ascii="Calibri" w:hAnsi="Calibri" w:cs="Calibri"/>
-          <w:i/>
-          <w:iCs/>
-          <w:lang w:val="es-ES"/>
-        </w:rPr>
-        <w:t>TypeScript</w:t>
-      </w:r>
-      <w:proofErr w:type="spellEnd"/>
-      <w:r>
-        <w:rPr>
-          <w:rFonts w:ascii="Calibri" w:hAnsi="Calibri" w:cs="Calibri"/>
-          <w:i/>
-          <w:iCs/>
-          <w:lang w:val="es-ES"/>
-        </w:rPr>
-        <w:t>, JavaScript, SQL.</w:t>
-      </w:r>
-    </w:p>
-    <w:p>
-      <w:pPr>
-        <w:spacing w:line="276" w:lineRule="auto"/>
-        <w:jc w:val="both"/>
-        <w:rPr>
-          <w:rFonts w:ascii="Calibri" w:hAnsi="Calibri" w:cs="Calibri"/>
-          <w:i/>
-          <w:iCs/>
-          <w:lang w:val="es-ES"/>
-        </w:rPr>
-      </w:pPr>
-      <w:r>
-        <w:rPr>
-          <w:rFonts w:ascii="Calibri" w:hAnsi="Calibri" w:cs="Calibri"/>
-          <w:b/>
-          <w:bCs/>
-          <w:i/>
-          <w:iCs/>
-          <w:lang w:val="es-ES"/>
-        </w:rPr>
-        <w:t xml:space="preserve">Desarrollo </w:t>
-      </w:r>
-      <w:proofErr w:type="spellStart"/>
-      <w:r>
-        <w:rPr>
-          <w:rFonts w:ascii="Calibri" w:hAnsi="Calibri" w:cs="Calibri"/>
-          <w:b/>
-          <w:bCs/>
-          <w:i/>
-          <w:iCs/>
-          <w:lang w:val="es-ES"/>
-        </w:rPr>
-        <w:t>Frontend</w:t>
-      </w:r>
-      <w:proofErr w:type="spellEnd"/>
-      <w:r>
-        <w:rPr>
-          <w:rFonts w:ascii="Calibri" w:hAnsi="Calibri" w:cs="Calibri"/>
-          <w:b/>
-          <w:bCs/>
-          <w:i/>
-          <w:iCs/>
-          <w:lang w:val="es-ES"/>
-        </w:rPr>
-        <w:t xml:space="preserve"> &amp; Diseño UI:</w:t>
-      </w:r>
-      <w:r>
-        <w:rPr>
-          <w:rFonts w:ascii="Calibri" w:hAnsi="Calibri" w:cs="Calibri"/>
-          <w:i/>
-          <w:iCs/>
-          <w:lang w:val="es-ES"/>
-        </w:rPr>
-        <w:t xml:space="preserve"> Angular, HTML5, CSS3, </w:t>
-      </w:r>
-      <w:proofErr w:type="spellStart"/>
-      <w:r>
-        <w:rPr>
-          <w:rFonts w:ascii="Calibri" w:hAnsi="Calibri" w:cs="Calibri"/>
-          <w:i/>
-          <w:iCs/>
-          <w:lang w:val="es-ES"/>
-        </w:rPr>
-        <w:t>Figma</w:t>
-      </w:r>
-      <w:proofErr w:type="spellEnd"/>
-      <w:r>
-        <w:rPr>
-          <w:rFonts w:ascii="Calibri" w:hAnsi="Calibri" w:cs="Calibri"/>
-          <w:i/>
-          <w:iCs/>
-          <w:lang w:val="es-ES"/>
-        </w:rPr>
-        <w:t xml:space="preserve">, Balsamiq </w:t>
-      </w:r>
-      <w:proofErr w:type="spellStart"/>
-      <w:r>
-        <w:rPr>
-          <w:rFonts w:ascii="Calibri" w:hAnsi="Calibri" w:cs="Calibri"/>
-          <w:i/>
-          <w:iCs/>
-          <w:lang w:val="es-ES"/>
-        </w:rPr>
-        <w:t>Wireframes</w:t>
-      </w:r>
-      <w:proofErr w:type="spellEnd"/>
-      <w:r>
-        <w:rPr>
-          <w:rFonts w:ascii="Calibri" w:hAnsi="Calibri" w:cs="Calibri"/>
-          <w:i/>
-          <w:iCs/>
-          <w:lang w:val="es-ES"/>
-        </w:rPr>
-        <w:t>.</w:t>
-      </w:r>
-    </w:p>
-    <w:p>
-      <w:pPr>
-        <w:spacing w:line="276" w:lineRule="auto"/>
-        <w:jc w:val="both"/>
-        <w:rPr>
-          <w:rFonts w:ascii="Calibri" w:hAnsi="Calibri" w:cs="Calibri"/>
-          <w:i/>
-          <w:iCs/>
-        </w:rPr>
-      </w:pPr>
-      <w:r>
-        <w:rPr>
-          <w:rFonts w:ascii="Calibri" w:hAnsi="Calibri" w:cs="Calibri"/>
-          <w:b/>
-          <w:bCs/>
-          <w:i/>
-          <w:iCs/>
-        </w:rPr>
-        <w:t>Desarrollo Backend &amp; APIs:</w:t>
-      </w:r>
-      <w:r>
-        <w:rPr>
-          <w:rFonts w:ascii="Calibri" w:hAnsi="Calibri" w:cs="Calibri"/>
-          <w:i/>
-          <w:iCs/>
-        </w:rPr>
-        <w:t xml:space="preserve"> Node.js, Spring Boot, Postman, Swagger UI, </w:t>
-      </w:r>
-      <w:proofErr w:type="spellStart"/>
-      <w:r>
-        <w:rPr>
-          <w:rFonts w:ascii="Calibri" w:hAnsi="Calibri" w:cs="Calibri"/>
-          <w:i/>
-          <w:iCs/>
-        </w:rPr>
-        <w:t>Arquitectura</w:t>
-      </w:r>
-      <w:proofErr w:type="spellEnd"/>
-      <w:r>
-        <w:rPr>
-          <w:rFonts w:ascii="Calibri" w:hAnsi="Calibri" w:cs="Calibri"/>
-          <w:i/>
-          <w:iCs/>
-        </w:rPr>
-        <w:t xml:space="preserve"> REST.</w:t>
-      </w:r>
-    </w:p>
-    <w:p>
-      <w:pPr>
-        <w:spacing w:line="276" w:lineRule="auto"/>
-        <w:jc w:val="both"/>
-        <w:rPr>
-          <w:rFonts w:ascii="Calibri" w:hAnsi="Calibri" w:cs="Calibri"/>
-          <w:i/>
-          <w:iCs/>
-          <w:lang w:val="es-ES"/>
-        </w:rPr>
-      </w:pPr>
-      <w:r>
-        <w:rPr>
-          <w:rFonts w:ascii="Calibri" w:hAnsi="Calibri" w:cs="Calibri"/>
-          <w:b/>
-          <w:bCs/>
-          <w:i/>
-          <w:iCs/>
-          <w:lang w:val="es-ES"/>
-        </w:rPr>
-        <w:t>Bases de Datos:</w:t>
-      </w:r>
-      <w:r>
-        <w:rPr>
-          <w:rFonts w:ascii="Calibri" w:hAnsi="Calibri" w:cs="Calibri"/>
-          <w:i/>
-          <w:iCs/>
-          <w:lang w:val="es-ES"/>
-        </w:rPr>
-        <w:t xml:space="preserve"> MySQL, SQL Server</w:t>
-      </w:r>
-      <w:r>
-        <w:rPr>
-          <w:rFonts w:ascii="Calibri" w:hAnsi="Calibri" w:cs="Calibri"/>
-          <w:i/>
-          <w:iCs/>
-          <w:lang w:val="es-ES"/>
-        </w:rPr>
-        <w:t>.</w:t>
-      </w:r>
-    </w:p>
-    <w:p>
-      <w:pPr>
-        <w:spacing w:line="276" w:lineRule="auto"/>
-        <w:jc w:val="both"/>
-        <w:rPr>
-          <w:rFonts w:ascii="Calibri" w:hAnsi="Calibri" w:cs="Calibri"/>
-          <w:i/>
-          <w:iCs/>
-          <w:lang w:val="es-ES"/>
-        </w:rPr>
-      </w:pPr>
-      <w:proofErr w:type="spellStart"/>
-      <w:r>
-        <w:rPr>
-          <w:rFonts w:ascii="Calibri" w:hAnsi="Calibri" w:cs="Calibri"/>
-          <w:b/>
-          <w:bCs/>
-          <w:i/>
-          <w:iCs/>
-          <w:lang w:val="es-ES"/>
-        </w:rPr>
-        <w:t>Testing</w:t>
-      </w:r>
-      <w:proofErr w:type="spellEnd"/>
-      <w:r>
-        <w:rPr>
-          <w:rFonts w:ascii="Calibri" w:hAnsi="Calibri" w:cs="Calibri"/>
-          <w:b/>
-          <w:bCs/>
-          <w:i/>
-          <w:iCs/>
-          <w:lang w:val="es-ES"/>
-        </w:rPr>
-        <w:t xml:space="preserve"> &amp; Automatización:</w:t>
-      </w:r>
-      <w:r>
-        <w:rPr>
-          <w:rFonts w:ascii="Calibri" w:hAnsi="Calibri" w:cs="Calibri"/>
-          <w:i/>
-          <w:iCs/>
-          <w:lang w:val="es-ES"/>
-        </w:rPr>
-        <w:t xml:space="preserve"> </w:t>
-      </w:r>
-      <w:proofErr w:type="spellStart"/>
-      <w:r>
-        <w:rPr>
-          <w:rFonts w:ascii="Calibri" w:hAnsi="Calibri" w:cs="Calibri"/>
-          <w:i/>
-          <w:iCs/>
-          <w:lang w:val="es-ES"/>
-        </w:rPr>
-        <w:t>Selenium</w:t>
-      </w:r>
-      <w:proofErr w:type="spellEnd"/>
-      <w:r>
-        <w:rPr>
-          <w:rFonts w:ascii="Calibri" w:hAnsi="Calibri" w:cs="Calibri"/>
-          <w:i/>
-          <w:iCs/>
-          <w:lang w:val="es-ES"/>
-        </w:rPr>
-        <w:t xml:space="preserve"> IDE, Pruebas funcionales.</w:t>
-      </w:r>
-    </w:p>
-    <w:p>
-      <w:pPr>
-        <w:spacing w:line="276" w:lineRule="auto"/>
-        <w:jc w:val="both"/>
-        <w:rPr>
-          <w:rFonts w:ascii="Calibri" w:hAnsi="Calibri" w:cs="Calibri"/>
-          <w:i/>
-          <w:iCs/>
-          <w:lang w:val="es-ES"/>
-        </w:rPr>
-      </w:pPr>
-      <w:r>
-        <w:rPr>
-          <w:rFonts w:ascii="Calibri" w:hAnsi="Calibri" w:cs="Calibri"/>
-          <w:b/>
-          <w:bCs/>
-          <w:i/>
-          <w:iCs/>
-          <w:lang w:val="es-ES"/>
-        </w:rPr>
-        <w:t>DevOps, Despliegue &amp; Herramientas:</w:t>
-      </w:r>
-      <w:r>
-        <w:rPr>
-          <w:rFonts w:ascii="Calibri" w:hAnsi="Calibri" w:cs="Calibri"/>
-          <w:i/>
-          <w:iCs/>
-          <w:lang w:val="es-ES"/>
-        </w:rPr>
-        <w:t xml:space="preserve"> </w:t>
-      </w:r>
-      <w:r>
-        <w:rPr>
-          <w:rFonts w:ascii="Calibri" w:hAnsi="Calibri" w:cs="Calibri"/>
-          <w:i/>
-          <w:iCs/>
-          <w:lang w:val="es-ES"/>
-        </w:rPr>
-        <w:t xml:space="preserve">Docker, Docker </w:t>
-      </w:r>
-      <w:proofErr w:type="spellStart"/>
-      <w:r>
-        <w:rPr>
-          <w:rFonts w:ascii="Calibri" w:hAnsi="Calibri" w:cs="Calibri"/>
-          <w:i/>
-          <w:iCs/>
-          <w:lang w:val="es-ES"/>
-        </w:rPr>
-        <w:t>Compose</w:t>
-      </w:r>
-      <w:proofErr w:type="spellEnd"/>
-      <w:r>
-        <w:rPr>
-          <w:rFonts w:ascii="Calibri" w:hAnsi="Calibri" w:cs="Calibri"/>
-          <w:i/>
-          <w:iCs/>
-          <w:lang w:val="es-ES"/>
-        </w:rPr>
-        <w:t>, Git, GitHub</w:t>
+      <w:r>
+        <w:rPr>
+          <w:rFonts w:ascii="Calibri" w:hAnsi="Calibri" w:cs="Calibri"/>
+          <w:i/>
+          <w:iCs/>
+          <w:lang w:val="es-ES"/>
+        </w:rPr>
+        <w:t>Docker, Docker Compose, Git, GitHub</w:t>
       </w:r>
       <w:r>
         <w:rPr>
@@ -812,27 +593,7 @@
           <w:iCs/>
           <w:lang w:val="es-ES"/>
         </w:rPr>
-        <w:t xml:space="preserve">Apoyé en el desarrollo del sistema de Posgrado mediante la implementación y mejora de interfaces, incorporando validaciones de datos e integridad de campos y realizando la conexión de las interfaces con el </w:t>
-      </w:r>
-      <w:proofErr w:type="spellStart"/>
-      <w:r>
-        <w:rPr>
-          <w:rFonts w:ascii="Calibri" w:hAnsi="Calibri" w:cs="Calibri"/>
-          <w:i/>
-          <w:iCs/>
-          <w:lang w:val="es-ES"/>
-        </w:rPr>
-        <w:t>backend</w:t>
-      </w:r>
-      <w:proofErr w:type="spellEnd"/>
-      <w:r>
-        <w:rPr>
-          <w:rFonts w:ascii="Calibri" w:hAnsi="Calibri" w:cs="Calibri"/>
-          <w:i/>
-          <w:iCs/>
-          <w:lang w:val="es-ES"/>
-        </w:rPr>
-        <w:t>.</w:t>
+        <w:t>Apoyé en el desarrollo del sistema de Posgrado mediante la implementación y mejora de interfaces, incorporando validaciones de datos e integridad de campos y realizando la conexión de las interfaces con el backend.</w:t>
       </w:r>
     </w:p>
     <w:p>
@@ -911,27 +672,7 @@
           <w:iCs/>
           <w:lang w:val="es-ES"/>
         </w:rPr>
-        <w:t xml:space="preserve">estableciendo un proceso formal de </w:t>
-      </w:r>
-      <w:proofErr w:type="spellStart"/>
-      <w:r>
-        <w:rPr>
-          <w:rFonts w:ascii="Calibri" w:eastAsia="Calibri" w:hAnsi="Calibri" w:cs="Calibri"/>
-          <w:i/>
-          <w:iCs/>
-          <w:lang w:val="es-ES"/>
-        </w:rPr>
-        <w:t>testing</w:t>
-      </w:r>
-      <w:proofErr w:type="spellEnd"/>
-      <w:r>
-        <w:rPr>
-          <w:rFonts w:ascii="Calibri" w:eastAsia="Calibri" w:hAnsi="Calibri" w:cs="Calibri"/>
-          <w:i/>
-          <w:iCs/>
-          <w:lang w:val="es-ES"/>
-        </w:rPr>
-        <w:t xml:space="preserve"> previo al despliegue</w:t>
+        <w:t>estableciendo un proceso formal de testing previo al despliegue</w:t>
       </w:r>
       <w:r>
         <w:rPr>
@@ -990,67 +731,7 @@
           <w:iCs/>
           <w:lang w:val="es-ES"/>
         </w:rPr>
-        <w:t xml:space="preserve">Automaticé pruebas funcionales con </w:t>
-      </w:r>
-      <w:proofErr w:type="spellStart"/>
-      <w:r>
-        <w:rPr>
-          <w:rFonts w:ascii="Calibri" w:eastAsia="Calibri" w:hAnsi="Calibri" w:cs="Calibri"/>
-          <w:i/>
-          <w:iCs/>
-          <w:lang w:val="es-ES"/>
-        </w:rPr>
-        <w:t>Selenium</w:t>
-      </w:r>
-      <w:proofErr w:type="spellEnd"/>
-      <w:r>
-        <w:rPr>
-          <w:rFonts w:ascii="Calibri" w:eastAsia="Calibri" w:hAnsi="Calibri" w:cs="Calibri"/>
-          <w:i/>
-          <w:iCs/>
-          <w:lang w:val="es-ES"/>
-        </w:rPr>
-        <w:t xml:space="preserve"> IDE y validaciones </w:t>
-      </w:r>
-      <w:proofErr w:type="spellStart"/>
-      <w:r>
-        <w:rPr>
-          <w:rFonts w:ascii="Calibri" w:eastAsia="Calibri" w:hAnsi="Calibri" w:cs="Calibri"/>
-          <w:i/>
-          <w:iCs/>
-          <w:lang w:val="es-ES"/>
-        </w:rPr>
-        <w:t>backend</w:t>
-      </w:r>
-      <w:proofErr w:type="spellEnd"/>
-      <w:r>
-        <w:rPr>
-          <w:rFonts w:ascii="Calibri" w:eastAsia="Calibri" w:hAnsi="Calibri" w:cs="Calibri"/>
-          <w:i/>
-          <w:iCs/>
-          <w:lang w:val="es-ES"/>
-        </w:rPr>
-        <w:t xml:space="preserve"> con Python y Google </w:t>
-      </w:r>
-      <w:proofErr w:type="spellStart"/>
-      <w:r>
-        <w:rPr>
-          <w:rFonts w:ascii="Calibri" w:eastAsia="Calibri" w:hAnsi="Calibri" w:cs="Calibri"/>
-          <w:i/>
-          <w:iCs/>
-          <w:lang w:val="es-ES"/>
-        </w:rPr>
-        <w:t>Colab</w:t>
-      </w:r>
-      <w:proofErr w:type="spellEnd"/>
-      <w:r>
-        <w:rPr>
-          <w:rFonts w:ascii="Calibri" w:eastAsia="Calibri" w:hAnsi="Calibri" w:cs="Calibri"/>
-          <w:i/>
-          <w:iCs/>
-          <w:lang w:val="es-ES"/>
-        </w:rPr>
-        <w:t xml:space="preserve"> en </w:t>
+        <w:t xml:space="preserve">Automaticé pruebas funcionales con Selenium IDE y validaciones backend con Python y Google Colab en </w:t>
       </w:r>
       <w:r>
         <w:rPr>
@@ -1118,25 +799,14 @@
           <w:lang w:val="es-ES"/>
         </w:rPr>
       </w:pPr>
-      <w:proofErr w:type="spellStart"/>
-      <w:r>
-        <w:rPr>
-          <w:rFonts w:ascii="Calibri" w:hAnsi="Calibri" w:cs="Calibri"/>
-          <w:i/>
-          <w:iCs/>
-          <w:lang w:val="es-ES"/>
-        </w:rPr>
-        <w:t>Reejecuté</w:t>
-      </w:r>
-      <w:proofErr w:type="spellEnd"/>
-      <w:r>
-        <w:rPr>
-          <w:rFonts w:ascii="Calibri" w:hAnsi="Calibri" w:cs="Calibri"/>
-          <w:i/>
-          <w:iCs/>
-          <w:lang w:val="es-ES"/>
-        </w:rPr>
-        <w:t xml:space="preserve"> los casos fallidos después de las correcciones para validar su solución</w:t>
+      <w:r>
+        <w:rPr>
+          <w:rFonts w:ascii="Calibri" w:hAnsi="Calibri" w:cs="Calibri"/>
+          <w:i/>
+          <w:iCs/>
+          <w:lang w:val="es-ES"/>
+        </w:rPr>
+        <w:t>Reejecuté los casos fallidos después de las correcciones para validar su solución</w:t>
       </w:r>
       <w:r>
         <w:rPr>
@@ -1214,25 +884,7 @@
           <w:i/>
           <w:iCs/>
         </w:rPr>
-        <w:t xml:space="preserve">: Selenium IDE, Python, Jupyter Notebook, Google </w:t>
-      </w:r>
-      <w:proofErr w:type="spellStart"/>
-      <w:r>
-        <w:rPr>
-          <w:rFonts w:ascii="Calibri" w:eastAsia="Calibri" w:hAnsi="Calibri" w:cs="Calibri"/>
-          <w:i/>
-          <w:iCs/>
-        </w:rPr>
-        <w:t>Colab</w:t>
-      </w:r>
-      <w:proofErr w:type="spellEnd"/>
-      <w:r>
-        <w:rPr>
-          <w:rFonts w:ascii="Calibri" w:eastAsia="Calibri" w:hAnsi="Calibri" w:cs="Calibri"/>
-          <w:i/>
-          <w:iCs/>
-        </w:rPr>
-        <w:t xml:space="preserve">, </w:t>
+        <w:t xml:space="preserve">: Selenium IDE, Python, Jupyter Notebook, Google Colab, </w:t>
       </w:r>
       <w:r>
         <w:rPr>
@@ -1368,27 +1020,7 @@
           <w:iCs/>
           <w:lang w:val="es-ES"/>
         </w:rPr>
-        <w:t>Aplicación web full-</w:t>
-      </w:r>
-      <w:proofErr w:type="spellStart"/>
-      <w:r>
-        <w:rPr>
-          <w:rFonts w:ascii="Calibri" w:eastAsia="Calibri" w:hAnsi="Calibri" w:cs="Calibri"/>
-          <w:i/>
-          <w:iCs/>
-          <w:lang w:val="es-ES"/>
-        </w:rPr>
-        <w:t>stack</w:t>
-      </w:r>
-      <w:proofErr w:type="spellEnd"/>
-      <w:r>
-        <w:rPr>
-          <w:rFonts w:ascii="Calibri" w:eastAsia="Calibri" w:hAnsi="Calibri" w:cs="Calibri"/>
-          <w:i/>
-          <w:iCs/>
-          <w:lang w:val="es-ES"/>
-        </w:rPr>
-        <w:t xml:space="preserve"> para reportar </w:t>
+        <w:t xml:space="preserve">Aplicación web full-stack para reportar </w:t>
       </w:r>
       <w:r>
         <w:rPr>
@@ -1474,7 +1106,7 @@
           <w:i/>
           <w:iCs/>
         </w:rPr>
-        <w:t>, Git/GitHub.</w:t>
+        <w:t>.</w:t>
       </w:r>
     </w:p>
     <w:p>
@@ -1522,27 +1154,7 @@
             <w:iCs/>
             <w:lang w:val="es-ES"/>
           </w:rPr>
-          <w:t>GitH</w:t>
-        </w:r>
-        <w:r>
-          <w:rPr>
-            <w:rStyle w:val="Hipervnculo"/>
-            <w:rFonts w:ascii="Calibri" w:hAnsi="Calibri" w:cs="Calibri"/>
-            <w:i/>
-            <w:iCs/>
-            <w:lang w:val="es-ES"/>
-          </w:rPr>
-          <w:t>u</w:t>
-        </w:r>
-        <w:r>
-          <w:rPr>
-            <w:rStyle w:val="Hipervnculo"/>
-            <w:rFonts w:ascii="Calibri" w:hAnsi="Calibri" w:cs="Calibri"/>
-            <w:i/>
-            <w:iCs/>
-            <w:lang w:val="es-ES"/>
-          </w:rPr>
-          <w:t>b</w:t>
+          <w:t>GitHub</w:t>
         </w:r>
       </w:hyperlink>
       <w:r>
@@ -1662,27 +1274,7 @@
           <w:iCs/>
           <w:lang w:val="es-ES"/>
         </w:rPr>
-        <w:t xml:space="preserve">Sistema web para optimizar la asignación almacén–zona sobre un mapa real, utilizando distancias por calle y respaldo automático ante fallos del servicio de rutas. Implementé algoritmos de optimización con </w:t>
-      </w:r>
-      <w:proofErr w:type="spellStart"/>
-      <w:r>
-        <w:rPr>
-          <w:rFonts w:ascii="Calibri" w:eastAsia="Calibri" w:hAnsi="Calibri" w:cs="Calibri"/>
-          <w:i/>
-          <w:iCs/>
-          <w:lang w:val="es-ES"/>
-        </w:rPr>
-        <w:t>KPIs</w:t>
-      </w:r>
-      <w:proofErr w:type="spellEnd"/>
-      <w:r>
-        <w:rPr>
-          <w:rFonts w:ascii="Calibri" w:eastAsia="Calibri" w:hAnsi="Calibri" w:cs="Calibri"/>
-          <w:i/>
-          <w:iCs/>
-          <w:lang w:val="es-ES"/>
-        </w:rPr>
-        <w:t xml:space="preserve"> de costo, distancia y utilización</w:t>
+        <w:t>Sistema web para optimizar la asignación almacén–zona sobre un mapa real, utilizando distancias por calle y respaldo automático ante fallos del servicio de rutas. Implementé algoritmos de optimización con KPIs de costo, distancia y utilización</w:t>
       </w:r>
       <w:r>
         <w:rPr>
@@ -1737,7 +1329,7 @@
           <w:iCs/>
           <w:lang w:val="es-ES"/>
         </w:rPr>
-        <w:t>JavaScript Vanilla, Leaflet.js, HTML</w:t>
+        <w:t>JavaScript, HTML</w:t>
       </w:r>
       <w:r>
         <w:rPr>
@@ -1882,7 +1474,6 @@
           <w:lang w:val="es-ES"/>
         </w:rPr>
       </w:pPr>
-      <w:proofErr w:type="spellStart"/>
       <w:r>
         <w:rPr>
           <w:rFonts w:ascii="Calibri" w:eastAsia="Calibri" w:hAnsi="Calibri" w:cs="Calibri"/>
@@ -1892,19 +1483,7 @@
           <w:szCs w:val="21"/>
           <w:lang w:val="es-ES"/>
         </w:rPr>
-        <w:t>RotaStock</w:t>
-      </w:r>
-      <w:proofErr w:type="spellEnd"/>
-      <w:r>
-        <w:rPr>
-          <w:rFonts w:ascii="Calibri" w:eastAsia="Calibri" w:hAnsi="Calibri" w:cs="Calibri"/>
-          <w:b/>
-          <w:bCs/>
-          <w:sz w:val="21"/>
-          <w:szCs w:val="21"/>
-          <w:lang w:val="es-ES"/>
-        </w:rPr>
-        <w:t xml:space="preserve"> Plus — Control de Inventario</w:t>
+        <w:t>RotaStock Plus — Control de Inventario</w:t>
       </w:r>
       <w:r>
         <w:rPr>
@@ -1996,67 +1575,7 @@
           <w:iCs/>
           <w:lang w:val="es-ES"/>
         </w:rPr>
-        <w:t xml:space="preserve">JavaScript Vanilla, </w:t>
-      </w:r>
-      <w:proofErr w:type="spellStart"/>
-      <w:r>
-        <w:rPr>
-          <w:rFonts w:ascii="Calibri" w:eastAsia="Calibri" w:hAnsi="Calibri" w:cs="Calibri"/>
-          <w:i/>
-          <w:iCs/>
-          <w:lang w:val="es-ES"/>
-        </w:rPr>
-        <w:t>Electron</w:t>
-      </w:r>
-      <w:proofErr w:type="spellEnd"/>
-      <w:r>
-        <w:rPr>
-          <w:rFonts w:ascii="Calibri" w:eastAsia="Calibri" w:hAnsi="Calibri" w:cs="Calibri"/>
-          <w:i/>
-          <w:iCs/>
-          <w:lang w:val="es-ES"/>
-        </w:rPr>
-        <w:t xml:space="preserve">, Chart.js, </w:t>
-      </w:r>
-      <w:proofErr w:type="spellStart"/>
-      <w:r>
-        <w:rPr>
-          <w:rFonts w:ascii="Calibri" w:eastAsia="Calibri" w:hAnsi="Calibri" w:cs="Calibri"/>
-          <w:i/>
-          <w:iCs/>
-          <w:lang w:val="es-ES"/>
-        </w:rPr>
-        <w:t>SheetJS</w:t>
-      </w:r>
-      <w:proofErr w:type="spellEnd"/>
-      <w:r>
-        <w:rPr>
-          <w:rFonts w:ascii="Calibri" w:eastAsia="Calibri" w:hAnsi="Calibri" w:cs="Calibri"/>
-          <w:i/>
-          <w:iCs/>
-          <w:lang w:val="es-ES"/>
-        </w:rPr>
-        <w:t xml:space="preserve">, </w:t>
-      </w:r>
-      <w:proofErr w:type="spellStart"/>
-      <w:r>
-        <w:rPr>
-          <w:rFonts w:ascii="Calibri" w:eastAsia="Calibri" w:hAnsi="Calibri" w:cs="Calibri"/>
-          <w:i/>
-          <w:iCs/>
-          <w:lang w:val="es-ES"/>
-        </w:rPr>
-        <w:t>jsPDF</w:t>
-      </w:r>
-      <w:proofErr w:type="spellEnd"/>
-      <w:r>
-        <w:rPr>
-          <w:rFonts w:ascii="Calibri" w:eastAsia="Calibri" w:hAnsi="Calibri" w:cs="Calibri"/>
-          <w:i/>
-          <w:iCs/>
-          <w:lang w:val="es-ES"/>
-        </w:rPr>
-        <w:t>, persistencia JSON</w:t>
+        <w:t>JavaScript, Electron, Chart.js, jsPDF, persistencia JSON</w:t>
       </w:r>
       <w:r>
         <w:rPr>
@@ -3297,6 +2816,7 @@
   <w:style w:type="character" w:default="1" w:styleId="Fuentedeprrafopredeter">
     <w:name w:val="Default Paragraph Font"/>
     <w:uiPriority w:val="1"/>
+    <w:semiHidden/>
     <w:unhideWhenUsed/>
   </w:style>
   <w:style w:type="table" w:default="1" w:styleId="Tablanormal">

</xml_diff>